<commit_message>
Redraw Figures 2-3: shared top legend (no data occlusion) and edge-anchored mediation arrows
Co-Authored-By: Claude Fable 5 <noreply@anthropic.com>
Claude-Session: https://claude.ai/code/session_01D4xmAkDKwnFZcWjChhtKdD
</commit_message>
<xml_diff>
--- a/work/out/CareerMate_RCT_BehavSci.docx
+++ b/work/out/CareerMate_RCT_BehavSci.docx
@@ -5259,7 +5259,7 @@
       <w:r>
         <w:drawing>
           <wp:inline distT="0" distB="0" distL="114300" distR="114300">
-            <wp:extent cx="6035040" cy="4372234"/>
+            <wp:extent cx="6035040" cy="4656538"/>
             <wp:effectExtent l="0" t="0" r="0" b="0"/>
             <wp:docPr id="101" name="Picture 101"/>
             <wp:cNvGraphicFramePr>
@@ -5283,7 +5283,7 @@
                   <pic:spPr>
                     <a:xfrm>
                       <a:off x="0" y="0"/>
-                      <a:ext cx="6035040" cy="4372234"/>
+                      <a:ext cx="6035040" cy="4656538"/>
                     </a:xfrm>
                     <a:prstGeom prst="rect">
                       <a:avLst/>
@@ -7413,7 +7413,7 @@
       <w:r>
         <w:drawing>
           <wp:inline distT="0" distB="0" distL="114300" distR="114300">
-            <wp:extent cx="5394960" cy="2433741"/>
+            <wp:extent cx="5394960" cy="2513864"/>
             <wp:effectExtent l="0" t="0" r="0" b="0"/>
             <wp:docPr id="102" name="Picture 102"/>
             <wp:cNvGraphicFramePr>
@@ -7437,7 +7437,7 @@
                   <pic:spPr>
                     <a:xfrm>
                       <a:off x="0" y="0"/>
-                      <a:ext cx="5394960" cy="2433741"/>
+                      <a:ext cx="5394960" cy="2513864"/>
                     </a:xfrm>
                     <a:prstGeom prst="rect">
                       <a:avLst/>

</xml_diff>